<commit_message>
Initial combination of three researches finished
</commit_message>
<xml_diff>
--- a/科研成果纸质提交/目录_封面_封底_王健.docx
+++ b/科研成果纸质提交/目录_封面_封底_王健.docx
@@ -7,36 +7,17 @@
         <w:spacing w:line="720" w:lineRule="auto"/>
         <w:jc w:val="center"/>
         <w:rPr>
+          <w:sz w:val="36"/>
+          <w:szCs w:val="36"/>
+        </w:rPr>
+      </w:pPr>
+      <w:r>
+        <w:rPr>
           <w:rFonts w:hint="eastAsia"/>
           <w:sz w:val="36"/>
           <w:szCs w:val="36"/>
         </w:rPr>
-      </w:pPr>
-      <w:r>
-        <w:rPr>
-          <w:rFonts w:hint="eastAsia"/>
-          <w:sz w:val="36"/>
-          <w:szCs w:val="36"/>
-        </w:rPr>
-        <w:t>学位科研纸质</w:t>
-      </w:r>
-      <w:proofErr w:type="gramStart"/>
-      <w:r>
-        <w:rPr>
-          <w:rFonts w:hint="eastAsia"/>
-          <w:sz w:val="36"/>
-          <w:szCs w:val="36"/>
-        </w:rPr>
-        <w:t>版证明</w:t>
-      </w:r>
-      <w:proofErr w:type="gramEnd"/>
-      <w:r>
-        <w:rPr>
-          <w:rFonts w:hint="eastAsia"/>
-          <w:sz w:val="36"/>
-          <w:szCs w:val="36"/>
-        </w:rPr>
-        <w:t>材料情况说明</w:t>
+        <w:t>学位科研纸质版证明材料情况说明</w:t>
       </w:r>
     </w:p>
     <w:p>
@@ -110,23 +91,7 @@
           <w:sz w:val="28"/>
           <w:szCs w:val="28"/>
         </w:rPr>
-        <w:t>出版社）现已全面实行电子化发行，其官方数据库仅提供单篇论文正文的下载，不再提供传统印刷版期刊的完整版式文件原因，本人的学位科研纸质</w:t>
-      </w:r>
-      <w:proofErr w:type="gramStart"/>
-      <w:r>
-        <w:rPr>
-          <w:sz w:val="28"/>
-          <w:szCs w:val="28"/>
-        </w:rPr>
-        <w:t>版证明</w:t>
-      </w:r>
-      <w:proofErr w:type="gramEnd"/>
-      <w:r>
-        <w:rPr>
-          <w:sz w:val="28"/>
-          <w:szCs w:val="28"/>
-        </w:rPr>
-        <w:t>材料确实不存在刊物封面、刊物目录以及刊物封底等页面。本人保证情况属实。</w:t>
+        <w:t>出版社）现已全面实行电子化发行，其官方数据库不再提供传统印刷版期刊的完整版式文件原因，本人的学位科研纸质版证明材料确实不存在刊物目录和刊物封底等页面。本人保证情况属实。</w:t>
       </w:r>
     </w:p>
     <w:p>
@@ -233,11 +198,54 @@
     <w:lsdException w:name="Emphasis" w:qFormat="1"/>
     <w:lsdException w:name="HTML Top of Form" w:semiHidden="1" w:uiPriority="99" w:unhideWhenUsed="1"/>
     <w:lsdException w:name="HTML Bottom of Form" w:semiHidden="1" w:uiPriority="99" w:unhideWhenUsed="1"/>
-    <w:lsdException w:name="Normal Table" w:semiHidden="1"/>
+    <w:lsdException w:name="Normal Table" w:semiHidden="1" w:unhideWhenUsed="1"/>
     <w:lsdException w:name="No List" w:semiHidden="1" w:uiPriority="99" w:unhideWhenUsed="1"/>
     <w:lsdException w:name="Outline List 1" w:semiHidden="1" w:uiPriority="99" w:unhideWhenUsed="1"/>
     <w:lsdException w:name="Outline List 2" w:semiHidden="1" w:uiPriority="99" w:unhideWhenUsed="1"/>
     <w:lsdException w:name="Outline List 3" w:semiHidden="1" w:uiPriority="99" w:unhideWhenUsed="1"/>
+    <w:lsdException w:name="Table Simple 1" w:semiHidden="1" w:unhideWhenUsed="1"/>
+    <w:lsdException w:name="Table Simple 2" w:semiHidden="1" w:unhideWhenUsed="1"/>
+    <w:lsdException w:name="Table Simple 3" w:semiHidden="1" w:unhideWhenUsed="1"/>
+    <w:lsdException w:name="Table Classic 1" w:semiHidden="1" w:unhideWhenUsed="1"/>
+    <w:lsdException w:name="Table Classic 2" w:semiHidden="1" w:unhideWhenUsed="1"/>
+    <w:lsdException w:name="Table Classic 3" w:semiHidden="1" w:unhideWhenUsed="1"/>
+    <w:lsdException w:name="Table Classic 4" w:semiHidden="1" w:unhideWhenUsed="1"/>
+    <w:lsdException w:name="Table Colorful 1" w:semiHidden="1" w:unhideWhenUsed="1"/>
+    <w:lsdException w:name="Table Colorful 2" w:semiHidden="1" w:unhideWhenUsed="1"/>
+    <w:lsdException w:name="Table Colorful 3" w:semiHidden="1" w:unhideWhenUsed="1"/>
+    <w:lsdException w:name="Table Columns 1" w:semiHidden="1" w:unhideWhenUsed="1"/>
+    <w:lsdException w:name="Table Columns 2" w:semiHidden="1" w:unhideWhenUsed="1"/>
+    <w:lsdException w:name="Table Columns 3" w:semiHidden="1" w:unhideWhenUsed="1"/>
+    <w:lsdException w:name="Table Columns 4" w:semiHidden="1" w:unhideWhenUsed="1"/>
+    <w:lsdException w:name="Table Columns 5" w:semiHidden="1" w:unhideWhenUsed="1"/>
+    <w:lsdException w:name="Table Grid 1" w:semiHidden="1" w:unhideWhenUsed="1"/>
+    <w:lsdException w:name="Table Grid 2" w:semiHidden="1" w:unhideWhenUsed="1"/>
+    <w:lsdException w:name="Table Grid 3" w:semiHidden="1" w:unhideWhenUsed="1"/>
+    <w:lsdException w:name="Table Grid 4" w:semiHidden="1" w:unhideWhenUsed="1"/>
+    <w:lsdException w:name="Table Grid 5" w:semiHidden="1" w:unhideWhenUsed="1"/>
+    <w:lsdException w:name="Table Grid 6" w:semiHidden="1" w:unhideWhenUsed="1"/>
+    <w:lsdException w:name="Table Grid 7" w:semiHidden="1" w:unhideWhenUsed="1"/>
+    <w:lsdException w:name="Table Grid 8" w:semiHidden="1" w:unhideWhenUsed="1"/>
+    <w:lsdException w:name="Table List 1" w:semiHidden="1" w:unhideWhenUsed="1"/>
+    <w:lsdException w:name="Table List 2" w:semiHidden="1" w:unhideWhenUsed="1"/>
+    <w:lsdException w:name="Table List 3" w:semiHidden="1" w:unhideWhenUsed="1"/>
+    <w:lsdException w:name="Table List 4" w:semiHidden="1" w:unhideWhenUsed="1"/>
+    <w:lsdException w:name="Table List 5" w:semiHidden="1" w:unhideWhenUsed="1"/>
+    <w:lsdException w:name="Table List 6" w:semiHidden="1" w:unhideWhenUsed="1"/>
+    <w:lsdException w:name="Table List 7" w:semiHidden="1" w:unhideWhenUsed="1"/>
+    <w:lsdException w:name="Table List 8" w:semiHidden="1" w:unhideWhenUsed="1"/>
+    <w:lsdException w:name="Table 3D effects 1" w:semiHidden="1" w:unhideWhenUsed="1"/>
+    <w:lsdException w:name="Table 3D effects 2" w:semiHidden="1" w:unhideWhenUsed="1"/>
+    <w:lsdException w:name="Table 3D effects 3" w:semiHidden="1" w:unhideWhenUsed="1"/>
+    <w:lsdException w:name="Table Contemporary" w:semiHidden="1" w:unhideWhenUsed="1"/>
+    <w:lsdException w:name="Table Elegant" w:semiHidden="1" w:unhideWhenUsed="1"/>
+    <w:lsdException w:name="Table Professional" w:semiHidden="1" w:unhideWhenUsed="1"/>
+    <w:lsdException w:name="Table Subtle 1" w:semiHidden="1" w:unhideWhenUsed="1"/>
+    <w:lsdException w:name="Table Subtle 2" w:semiHidden="1" w:unhideWhenUsed="1"/>
+    <w:lsdException w:name="Table Web 1" w:semiHidden="1" w:unhideWhenUsed="1"/>
+    <w:lsdException w:name="Table Web 2" w:semiHidden="1" w:unhideWhenUsed="1"/>
+    <w:lsdException w:name="Table Web 3" w:semiHidden="1" w:unhideWhenUsed="1"/>
+    <w:lsdException w:name="Table Theme" w:semiHidden="1" w:unhideWhenUsed="1"/>
     <w:lsdException w:name="Placeholder Text" w:semiHidden="1" w:uiPriority="99" w:unhideWhenUsed="1"/>
     <w:lsdException w:name="No Spacing" w:uiPriority="99" w:qFormat="1"/>
     <w:lsdException w:name="Light Shading" w:uiPriority="60"/>
@@ -474,12 +482,16 @@
   </w:style>
   <w:style w:type="character" w:default="1" w:styleId="DefaultParagraphFont">
     <w:name w:val="Default Paragraph Font"/>
-    <w:semiHidden/>
+    <w:uiPriority w:val="1"/>
+    <w:unhideWhenUsed/>
   </w:style>
   <w:style w:type="table" w:default="1" w:styleId="TableNormal">
     <w:name w:val="Normal Table"/>
+    <w:uiPriority w:val="99"/>
     <w:semiHidden/>
+    <w:unhideWhenUsed/>
     <w:tblPr>
+      <w:tblInd w:w="0" w:type="dxa"/>
       <w:tblCellMar>
         <w:top w:w="0" w:type="dxa"/>
         <w:left w:w="108" w:type="dxa"/>

</xml_diff>